<commit_message>
Article 1 v8: lighter abstract, discussion and conclusion; release metadata 6.5
Numbers of secondary checks moved from the main text to the supplement (P2-P4);
English abstract trimmed to 242 words; footnote now cites tag v6.5 and the Zenodo
concept DOI with the version number instead of placeholders. Two text numbers
recomputed under V12 after the fact check (beyond-spectrum residuals, regionally
resolved steps; v12_extra_checks.json). CITATION.cff / .zenodo.json bumped to 6.5
(isNewVersionOf 10.5281/zenodo.22900149), README status for the revision.

Co-Authored-By: Claude Fable 5.1 <noreply@anthropic.com>
</commit_message>
<xml_diff>
--- a/manuscript_v2/article1/article1_v8.docx
+++ b/manuscript_v2/article1/article1_v8.docx
@@ -109,47 +109,7 @@
           <w:rFonts w:ascii="Times New Roman" w:hAnsi="Times New Roman"/>
           <w:sz w:val="24"/>
         </w:rPr>
-        <w:t xml:space="preserve">Спектральный и фрактальный анализ географических полей отвечает на вопрос, на каких масштабах располагаются уровни организации геосистемы. Следующий вопрос касается отношения между уровнями: размещается ли мезомасштабная изменчивость там же, где активен соседний крупный уровень, или независимо от него. По полю относительного вихря на поверхности 850 гПа (реанализ ERA5, 2017–2024 гг.; 12 основных и 27 контрольных областей) построена мера такого отношения – профиль сопряженности соседних октавных полос масштаба</w:t>
-      </w:r>
-      <w:r>
-        <w:rPr>
-          <w:rFonts w:ascii="Times New Roman" w:hAnsi="Times New Roman"/>
-          <w:sz w:val="24"/>
-        </w:rPr>
-        <w:t xml:space="preserve"> </w:t>
-      </w:r>
-      <m:oMath>
-        <m:r>
-          <m:t>P</m:t>
-        </m:r>
-      </m:oMath>
-      <w:r>
-        <w:rPr>
-          <w:rFonts w:ascii="Times New Roman" w:hAnsi="Times New Roman"/>
-          <w:sz w:val="24"/>
-        </w:rPr>
-        <w:t xml:space="preserve">: пространственная ранговая корреляция карт активности двух соседних полос, дополненная превышением над фазовыми суррогатами поля. Проверена гипотеза о том, что профиль является региональным инвариантом в операциональном смысле: различает циркуляционные режимы и воспроизводится между сезонными окнами разных лет и фаз Эль-Ниньо – Южного колебания, в двух реанализах и при двух схемах разбиения территории. Региональная группировка профилей подтверждена на отложенных окнах (</w:t>
-      </w:r>
-      <m:oMath>
-        <m:r>
-          <m:t>p</m:t>
-        </m:r>
-        <m:r>
-          <m:rPr>
-            <m:sty m:val="p"/>
-          </m:rPr>
-          <m:t>=</m:t>
-        </m:r>
-        <m:r>
-          <m:t>0.001</m:t>
-        </m:r>
-      </m:oMath>
-      <w:r>
-        <w:rPr>
-          <w:rFonts w:ascii="Times New Roman" w:hAnsi="Times New Roman"/>
-          <w:sz w:val="24"/>
-        </w:rPr>
-        <w:t xml:space="preserve">) и при перестановках внутри страт сезона, года и периода; на долю региона приходится 0.6–0.7 дисперсии профиля. Сигнатура сохраняется на ступенях, разрешенных реанализом, воспроизводится при равновеликой нарезке территории, во втором реанализе и в свободном модельном расчете без усвоения атмосферных наблюдений (ранговая корреляция географии 0.72 по 39 областям). Более высокие значения свойственны тропическому теплому бассейну Тихого океана, бассейну Конго и внетропическим штормовым путям, более низкие – континентальным областям и Амазонии; бассейны Конго и Амазонии при сходных стандартных характеристиках режима различаются сопряженностью крупных полос. Величина дополняет аппарат районирования характеристикой устройства межуровневых связей; границы ее применимости указаны явно.</w:t>
+        <w:t xml:space="preserve">Спектральный и фрактальный анализ географических полей отвечает на вопрос, на каких масштабах располагаются уровни организации геосистемы. Следующий вопрос касается отношения между уровнями: размещается ли мезомасштабная изменчивость там же, где активен соседний крупный уровень, или независимо от него. По полю относительного вихря на поверхности 850 гПа (реанализ ERA5, 2017–2024 гг.; 12 основных и 27 контрольных областей) построена мера такого отношения – профиль сопряженности соседних октавных полос масштаба: пространственная ранговая корреляция карт активности двух соседних полос, дополненная превышением над фазовыми суррогатами поля. Проверена гипотеза о том, что профиль является региональным инвариантом в операциональном смысле: различает циркуляционные режимы и воспроизводится между сезонными окнами разных лет и фаз Эль-Ниньо – Южного колебания. Региональная группировка профилей подтверждена на отложенных окнах и при перестановках внутри страт сезона, года и периода; на долю региона приходится 0.6–0.7 дисперсии профиля. Группировка сохраняется на ступенях, разрешенных реанализом, при равновеликой нарезке территории, во втором реанализе и в свободном модельном расчете без усвоения атмосферных наблюдений. Более высокие значения свойственны тропическому теплому бассейну Тихого океана, бассейну Конго и внетропическим штормовым путям, более низкие – континентальным областям и Амазонии; бассейны Конго и Амазонии при сходных стандартных характеристиках режима различаются сопряженностью крупных полос. Величина дополняет аппарат районирования характеристикой устройства межуровневых связей; границы ее применимости указаны явно.</w:t>
       </w:r>
     </w:p>
     <w:p>
@@ -4110,7 +4070,83 @@
           <w:rFonts w:ascii="Times New Roman" w:hAnsi="Times New Roman"/>
           <w:sz w:val="24"/>
         </w:rPr>
-        <w:t xml:space="preserve">0.95; по отдельным регионам 0.70–1.00; рис. П2 дополнительных материалов). Замена фиксированной октавной лестницы на лестницу, масштабированную локальным радиусом деформации, сохраняет сигнатуру (</w:t>
+        <w:t xml:space="preserve">0.95; по отдельным регионам 0.70–1.00; рис. П2 дополнительных материалов). Замена октавной лестницы на лестницу, масштабированную локальным радиусом деформации, и вариация протяженности областей на</w:t>
+      </w:r>
+      <w:r>
+        <w:rPr>
+          <w:rFonts w:ascii="Times New Roman" w:hAnsi="Times New Roman"/>
+          <w:sz w:val="24"/>
+        </w:rPr>
+        <w:t xml:space="preserve"> </w:t>
+      </w:r>
+      <m:oMath>
+        <m:r>
+          <m:rPr>
+            <m:sty m:val="p"/>
+          </m:rPr>
+          <m:t>±</m:t>
+        </m:r>
+        <m:r>
+          <m:t>10</m:t>
+        </m:r>
+        <m:r>
+          <m:rPr>
+            <m:sty m:val="p"/>
+          </m:rPr>
+          <m:t>%</m:t>
+        </m:r>
+      </m:oMath>
+      <w:r>
+        <w:rPr>
+          <w:rFonts w:ascii="Times New Roman" w:hAnsi="Times New Roman"/>
+          <w:sz w:val="24"/>
+        </w:rPr>
+        <w:t xml:space="preserve"> </w:t>
+      </w:r>
+      <w:r>
+        <w:rPr>
+          <w:rFonts w:ascii="Times New Roman" w:hAnsi="Times New Roman"/>
+          <w:sz w:val="24"/>
+        </w:rPr>
+        <w:t xml:space="preserve">результата не меняют (дополнительные материалы, П2).</w:t>
+      </w:r>
+    </w:p>
+    <w:p>
+      <w:pPr>
+        <w:pStyle w:val="BodyText"/>
+      </w:pPr>
+      <w:r>
+        <w:rPr>
+          <w:rFonts w:ascii="Times New Roman" w:hAnsi="Times New Roman"/>
+          <w:sz w:val="24"/>
+        </w:rPr>
+        <w:t xml:space="preserve">Отдельный вопрос – содержит ли профиль информацию сверх спектра мощности поля, который сам по себе различает регионы сильнее профиля. Группировка регрессионных остатков профиля по спектральным признакам воспроизводится на одних выборках и отсутствует на других (дополнительные материалы, П4); утверждение об информации сверх спектра в настоящей работе поэтому не делается и оставлено как открытый вопрос второй статьи серии.</w:t>
+      </w:r>
+    </w:p>
+    <w:bookmarkEnd w:id="16"/>
+    <w:bookmarkStart w:id="17" w:name="Xdf891d5aa731869597658ac13828a0f9dcccd63"/>
+    <w:p>
+      <w:pPr>
+        <w:pStyle w:val="Heading2"/>
+      </w:pPr>
+      <w:r>
+        <w:rPr>
+          <w:rFonts w:ascii="Times New Roman" w:hAnsi="Times New Roman"/>
+          <w:sz w:val="24"/>
+        </w:rPr>
+        <w:t xml:space="preserve">География воспроизводится во втором реанализе и в свободном модельном расчете</w:t>
+      </w:r>
+    </w:p>
+    <w:p>
+      <w:pPr>
+        <w:pStyle w:val="FirstParagraph"/>
+      </w:pPr>
+      <w:r>
+        <w:rPr>
+          <w:rFonts w:ascii="Times New Roman" w:hAnsi="Times New Roman"/>
+          <w:sz w:val="24"/>
+        </w:rPr>
+        <w:t xml:space="preserve">Реанализ восстанавливает состояние атмосферы моделью, усваивающей наблюдения, и плотность наблюдений неоднородна; не отражает ли региональная география размещение станций и спутниковых треков? Первая проверка – второй реанализ MERRA-2 (Gelaro et al., 2017), построенный на другой модели общей циркуляции и другой системе усвоения; его сетка не разрешает полос мельче 200 км, поэтому сопоставление ведется по разрешенным ступеням, а узлы под рельефом (34% в Центральной Азии, 7% на юге Южной Америки) исключены так же, как в ERA5. Региональная сигнатура воспроизводится в MERRA-2 с тем же размером эффекта, что и на отложенных окнах ERA5 (</w:t>
       </w:r>
       <m:oMath>
         <m:r>
@@ -4132,7 +4168,7 @@
           <m:t>+</m:t>
         </m:r>
         <m:r>
-          <m:t>1.53</m:t>
+          <m:t>1.09</m:t>
         </m:r>
       </m:oMath>
       <w:r>
@@ -4168,99 +4204,11 @@
           <w:rFonts w:ascii="Times New Roman" w:hAnsi="Times New Roman"/>
           <w:sz w:val="24"/>
         </w:rPr>
-        <w:t xml:space="preserve">), а вариация зональной протяженности равновеликих областей на</w:t>
-      </w:r>
-      <w:r>
-        <w:rPr>
-          <w:rFonts w:ascii="Times New Roman" w:hAnsi="Times New Roman"/>
-          <w:sz w:val="24"/>
-        </w:rPr>
-        <w:t xml:space="preserve"> </w:t>
+        <w:t xml:space="preserve">; 48 регион-окон 2023–2024 гг.), а региональная география совпадает с ERA5 с ранговой корреляцией 0.77 по двенадцати областям (</w:t>
       </w:r>
       <m:oMath>
         <m:r>
-          <m:rPr>
-            <m:sty m:val="p"/>
-          </m:rPr>
-          <m:t>±</m:t>
-        </m:r>
-        <m:r>
-          <m:t>10</m:t>
-        </m:r>
-        <m:r>
-          <m:rPr>
-            <m:sty m:val="p"/>
-          </m:rPr>
-          <m:t>%</m:t>
-        </m:r>
-      </m:oMath>
-      <w:r>
-        <w:rPr>
-          <w:rFonts w:ascii="Times New Roman" w:hAnsi="Times New Roman"/>
-          <w:sz w:val="24"/>
-        </w:rPr>
-        <w:t xml:space="preserve"> </w:t>
-      </w:r>
-      <w:r>
-        <w:rPr>
-          <w:rFonts w:ascii="Times New Roman" w:hAnsi="Times New Roman"/>
-          <w:sz w:val="24"/>
-        </w:rPr>
-        <w:t xml:space="preserve">воспроизводит профили каждого региона с</w:t>
-      </w:r>
-      <w:r>
-        <w:rPr>
-          <w:rFonts w:ascii="Times New Roman" w:hAnsi="Times New Roman"/>
-          <w:sz w:val="24"/>
-        </w:rPr>
-        <w:t xml:space="preserve"> </w:t>
-      </w:r>
-      <m:oMath>
-        <m:r>
-          <m:t>ρ</m:t>
-        </m:r>
-        <m:r>
-          <m:rPr>
-            <m:sty m:val="p"/>
-          </m:rPr>
-          <m:t>≥</m:t>
-        </m:r>
-        <m:r>
-          <m:t>0.95</m:t>
-        </m:r>
-      </m:oMath>
-      <w:r>
-        <w:rPr>
-          <w:rFonts w:ascii="Times New Roman" w:hAnsi="Times New Roman"/>
-          <w:sz w:val="24"/>
-        </w:rPr>
-        <w:t xml:space="preserve">.</w:t>
-      </w:r>
-    </w:p>
-    <w:p>
-      <w:pPr>
-        <w:pStyle w:val="BodyText"/>
-      </w:pPr>
-      <w:r>
-        <w:rPr>
-          <w:rFonts w:ascii="Times New Roman" w:hAnsi="Times New Roman"/>
-          <w:sz w:val="24"/>
-        </w:rPr>
-        <w:t xml:space="preserve">Отдельный вопрос – содержит ли профиль информацию сверх спектра мощности поля, который сам по себе различает регионы сильнее профиля. Регрессионные остатки профиля после удаления части, линейно предсказуемой по спектральным признакам, группируются по регионам на одних выборках (по ступеням 2–5:</w:t>
-      </w:r>
-      <w:r>
-        <w:rPr>
-          <w:rFonts w:ascii="Times New Roman" w:hAnsi="Times New Roman"/>
-          <w:sz w:val="24"/>
-        </w:rPr>
-        <w:t xml:space="preserve"> </w:t>
-      </w:r>
-      <m:oMath>
-        <m:r>
-          <m:rPr>
-            <m:sty m:val="p"/>
-          </m:rPr>
-          <m:t>Δ</m:t>
+          <m:t>p</m:t>
         </m:r>
         <m:r>
           <m:rPr>
@@ -4269,13 +4217,7 @@
           <m:t>=</m:t>
         </m:r>
         <m:r>
-          <m:rPr>
-            <m:sty m:val="p"/>
-          </m:rPr>
-          <m:t>+</m:t>
-        </m:r>
-        <m:r>
-          <m:t>0.33</m:t>
+          <m:t>0.003</m:t>
         </m:r>
       </m:oMath>
       <w:r>
@@ -4283,299 +4225,7 @@
           <w:rFonts w:ascii="Times New Roman" w:hAnsi="Times New Roman"/>
           <w:sz w:val="24"/>
         </w:rPr>
-        <w:t xml:space="preserve">,</w:t>
-      </w:r>
-      <w:r>
-        <w:rPr>
-          <w:rFonts w:ascii="Times New Roman" w:hAnsi="Times New Roman"/>
-          <w:sz w:val="24"/>
-        </w:rPr>
-        <w:t xml:space="preserve"> </w:t>
-      </w:r>
-      <m:oMath>
-        <m:r>
-          <m:t>p</m:t>
-        </m:r>
-        <m:r>
-          <m:rPr>
-            <m:sty m:val="p"/>
-          </m:rPr>
-          <m:t>=</m:t>
-        </m:r>
-        <m:r>
-          <m:t>0.011</m:t>
-        </m:r>
-      </m:oMath>
-      <w:r>
-        <w:rPr>
-          <w:rFonts w:ascii="Times New Roman" w:hAnsi="Times New Roman"/>
-          <w:sz w:val="24"/>
-        </w:rPr>
-        <w:t xml:space="preserve"> </w:t>
-      </w:r>
-      <w:r>
-        <w:rPr>
-          <w:rFonts w:ascii="Times New Roman" w:hAnsi="Times New Roman"/>
-          <w:sz w:val="24"/>
-        </w:rPr>
-        <w:t xml:space="preserve">на 32 отложенных окнах;</w:t>
-      </w:r>
-      <w:r>
-        <w:rPr>
-          <w:rFonts w:ascii="Times New Roman" w:hAnsi="Times New Roman"/>
-          <w:sz w:val="24"/>
-        </w:rPr>
-        <w:t xml:space="preserve"> </w:t>
-      </w:r>
-      <m:oMath>
-        <m:r>
-          <m:rPr>
-            <m:sty m:val="p"/>
-          </m:rPr>
-          <m:t>Δ</m:t>
-        </m:r>
-        <m:r>
-          <m:rPr>
-            <m:sty m:val="p"/>
-          </m:rPr>
-          <m:t>=</m:t>
-        </m:r>
-        <m:r>
-          <m:rPr>
-            <m:sty m:val="p"/>
-          </m:rPr>
-          <m:t>+</m:t>
-        </m:r>
-        <m:r>
-          <m:t>0.40</m:t>
-        </m:r>
-      </m:oMath>
-      <w:r>
-        <w:rPr>
-          <w:rFonts w:ascii="Times New Roman" w:hAnsi="Times New Roman"/>
-          <w:sz w:val="24"/>
-        </w:rPr>
-        <w:t xml:space="preserve">,</w:t>
-      </w:r>
-      <w:r>
-        <w:rPr>
-          <w:rFonts w:ascii="Times New Roman" w:hAnsi="Times New Roman"/>
-          <w:sz w:val="24"/>
-        </w:rPr>
-        <w:t xml:space="preserve"> </w:t>
-      </w:r>
-      <m:oMath>
-        <m:r>
-          <m:t>p</m:t>
-        </m:r>
-        <m:r>
-          <m:rPr>
-            <m:sty m:val="p"/>
-          </m:rPr>
-          <m:t>=</m:t>
-        </m:r>
-        <m:r>
-          <m:t>0.001</m:t>
-        </m:r>
-      </m:oMath>
-      <w:r>
-        <w:rPr>
-          <w:rFonts w:ascii="Times New Roman" w:hAnsi="Times New Roman"/>
-          <w:sz w:val="24"/>
-        </w:rPr>
-        <w:t xml:space="preserve"> </w:t>
-      </w:r>
-      <w:r>
-        <w:rPr>
-          <w:rFonts w:ascii="Times New Roman" w:hAnsi="Times New Roman"/>
-          <w:sz w:val="24"/>
-        </w:rPr>
-        <w:t xml:space="preserve">на всех 96) и не группируются на других (</w:t>
-      </w:r>
-      <m:oMath>
-        <m:r>
-          <m:rPr>
-            <m:sty m:val="p"/>
-          </m:rPr>
-          <m:t>Δ</m:t>
-        </m:r>
-        <m:r>
-          <m:rPr>
-            <m:sty m:val="p"/>
-          </m:rPr>
-          <m:t>≈</m:t>
-        </m:r>
-        <m:r>
-          <m:t>0</m:t>
-        </m:r>
-      </m:oMath>
-      <w:r>
-        <w:rPr>
-          <w:rFonts w:ascii="Times New Roman" w:hAnsi="Times New Roman"/>
-          <w:sz w:val="24"/>
-        </w:rPr>
-        <w:t xml:space="preserve">,</w:t>
-      </w:r>
-      <w:r>
-        <w:rPr>
-          <w:rFonts w:ascii="Times New Roman" w:hAnsi="Times New Roman"/>
-          <w:sz w:val="24"/>
-        </w:rPr>
-        <w:t xml:space="preserve"> </w:t>
-      </w:r>
-      <m:oMath>
-        <m:r>
-          <m:t>p</m:t>
-        </m:r>
-        <m:r>
-          <m:rPr>
-            <m:sty m:val="p"/>
-          </m:rPr>
-          <m:t>=</m:t>
-        </m:r>
-        <m:r>
-          <m:t>0.56</m:t>
-        </m:r>
-      </m:oMath>
-      <w:r>
-        <w:rPr>
-          <w:rFonts w:ascii="Times New Roman" w:hAnsi="Times New Roman"/>
-          <w:sz w:val="24"/>
-        </w:rPr>
-        <w:t xml:space="preserve"> </w:t>
-      </w:r>
-      <w:r>
-        <w:rPr>
-          <w:rFonts w:ascii="Times New Roman" w:hAnsi="Times New Roman"/>
-          <w:sz w:val="24"/>
-        </w:rPr>
-        <w:t xml:space="preserve">на 48 основных окнах 2023–2024 гг.); проверка на уровне целых областей для отложенных окон результата не подтверждает (</w:t>
-      </w:r>
-      <m:oMath>
-        <m:r>
-          <m:t>p</m:t>
-        </m:r>
-        <m:r>
-          <m:rPr>
-            <m:sty m:val="p"/>
-          </m:rPr>
-          <m:t>=</m:t>
-        </m:r>
-        <m:r>
-          <m:t>0.61</m:t>
-        </m:r>
-      </m:oMath>
-      <w:r>
-        <w:rPr>
-          <w:rFonts w:ascii="Times New Roman" w:hAnsi="Times New Roman"/>
-          <w:sz w:val="24"/>
-        </w:rPr>
-        <w:t xml:space="preserve">). Утверждение о воспроизводимой информации сверх спектра в настоящей работе поэтому не делается; оно оставлено как открытый вопрос второй статьи серии.</w:t>
-      </w:r>
-    </w:p>
-    <w:bookmarkEnd w:id="16"/>
-    <w:bookmarkStart w:id="17" w:name="Xdf891d5aa731869597658ac13828a0f9dcccd63"/>
-    <w:p>
-      <w:pPr>
-        <w:pStyle w:val="Heading2"/>
-      </w:pPr>
-      <w:r>
-        <w:rPr>
-          <w:rFonts w:ascii="Times New Roman" w:hAnsi="Times New Roman"/>
-          <w:sz w:val="24"/>
-        </w:rPr>
-        <w:t xml:space="preserve">География воспроизводится во втором реанализе и в свободном модельном расчете</w:t>
-      </w:r>
-    </w:p>
-    <w:p>
-      <w:pPr>
-        <w:pStyle w:val="FirstParagraph"/>
-      </w:pPr>
-      <w:r>
-        <w:rPr>
-          <w:rFonts w:ascii="Times New Roman" w:hAnsi="Times New Roman"/>
-          <w:sz w:val="24"/>
-        </w:rPr>
-        <w:t xml:space="preserve">Реанализ восстанавливает состояние атмосферы моделью, усваивающей наблюдения, и плотность наблюдений неоднородна; не отражает ли региональная география размещение станций и спутниковых треков? Первая проверка – второй реанализ MERRA-2 (Gelaro et al., 2017), построенный на другой модели общей циркуляции и другой системе усвоения; его сетка не разрешает полос мельче 200 км, поэтому сопоставление ведется по разрешенным ступеням, а узлы под рельефом (34% в Центральной Азии, 7% на юге Южной Америки) исключены так же, как в ERA5. Региональная сигнатура воспроизводится в MERRA-2 с тем же размером эффекта, что и на отложенных окнах ERA5 (</w:t>
-      </w:r>
-      <m:oMath>
-        <m:r>
-          <m:rPr>
-            <m:sty m:val="p"/>
-          </m:rPr>
-          <m:t>Δ</m:t>
-        </m:r>
-        <m:r>
-          <m:rPr>
-            <m:sty m:val="p"/>
-          </m:rPr>
-          <m:t>=</m:t>
-        </m:r>
-        <m:r>
-          <m:rPr>
-            <m:sty m:val="p"/>
-          </m:rPr>
-          <m:t>+</m:t>
-        </m:r>
-        <m:r>
-          <m:t>1.09</m:t>
-        </m:r>
-      </m:oMath>
-      <w:r>
-        <w:rPr>
-          <w:rFonts w:ascii="Times New Roman" w:hAnsi="Times New Roman"/>
-          <w:sz w:val="24"/>
-        </w:rPr>
-        <w:t xml:space="preserve">,</w:t>
-      </w:r>
-      <w:r>
-        <w:rPr>
-          <w:rFonts w:ascii="Times New Roman" w:hAnsi="Times New Roman"/>
-          <w:sz w:val="24"/>
-        </w:rPr>
-        <w:t xml:space="preserve"> </w:t>
-      </w:r>
-      <m:oMath>
-        <m:r>
-          <m:t>p</m:t>
-        </m:r>
-        <m:r>
-          <m:rPr>
-            <m:sty m:val="p"/>
-          </m:rPr>
-          <m:t>=</m:t>
-        </m:r>
-        <m:r>
-          <m:t>0.001</m:t>
-        </m:r>
-      </m:oMath>
-      <w:r>
-        <w:rPr>
-          <w:rFonts w:ascii="Times New Roman" w:hAnsi="Times New Roman"/>
-          <w:sz w:val="24"/>
-        </w:rPr>
-        <w:t xml:space="preserve">; 48 регион-окон 2023–2024 гг.), а региональная география совпадает с ERA5 с ранговой корреляцией 0.77 по двенадцати областям (</w:t>
-      </w:r>
-      <m:oMath>
-        <m:r>
-          <m:t>p</m:t>
-        </m:r>
-        <m:r>
-          <m:rPr>
-            <m:sty m:val="p"/>
-          </m:rPr>
-          <m:t>=</m:t>
-        </m:r>
-        <m:r>
-          <m:t>0.003</m:t>
-        </m:r>
-      </m:oMath>
-      <w:r>
-        <w:rPr>
-          <w:rFonts w:ascii="Times New Roman" w:hAnsi="Times New Roman"/>
-          <w:sz w:val="24"/>
-        </w:rPr>
-        <w:t xml:space="preserve">; строка 5). Обе статистики описательные: протокол межреанализной проверки был заморожен для другой величины программы, а для профиля вычислен по тем же окнам после факта. Проверка квазинезависима: оба реанализа усваивают в основном одни и те же наблюдения (Gelaro et al., 2017; Hersbach et al., 2020).</w:t>
+        <w:t xml:space="preserve">; строка 5). Обе статистики описательные (протокол межреанализной проверки был заморожен для другой величины программы), а проверка квазинезависима: оба реанализа усваивают в основном одни и те же наблюдения (Gelaro et al., 2017; Hersbach et al., 2020).</w:t>
       </w:r>
     </w:p>
     <w:p>
@@ -4847,7 +4497,7 @@
           <w:rFonts w:ascii="Times New Roman" w:hAnsi="Times New Roman"/>
           <w:sz w:val="24"/>
         </w:rPr>
-        <w:t xml:space="preserve">Дескриптор должен измерять заявленное: насколько размещение мелкого уровня пространственно сопряжено с размещением соседнего крупного. Для проверки построена независимая мера – невосстановимость размещения</w:t>
+        <w:t xml:space="preserve">Дескриптор должен измерять заявленное: насколько размещение мелкого уровня пространственно сопряжено с размещением соседнего крупного. Независимая информационная мера – невосстановимость размещения</w:t>
       </w:r>
       <w:r>
         <w:rPr>
@@ -4857,115 +4507,20 @@
         <w:t xml:space="preserve"> </w:t>
       </w:r>
       <m:oMath>
-        <m:sSub>
-          <m:e>
-            <m:r>
-              <m:t>u</m:t>
-            </m:r>
-          </m:e>
-          <m:sub>
-            <m:r>
-              <m:t>i</m:t>
-            </m:r>
-          </m:sub>
-        </m:sSub>
+        <m:r>
+          <m:t>u</m:t>
+        </m:r>
       </m:oMath>
       <w:r>
         <w:rPr>
           <w:rFonts w:ascii="Times New Roman" w:hAnsi="Times New Roman"/>
           <w:sz w:val="24"/>
         </w:rPr>
-        <w:t xml:space="preserve">: ранги полей</w:t>
-      </w:r>
-      <w:r>
-        <w:rPr>
-          <w:rFonts w:ascii="Times New Roman" w:hAnsi="Times New Roman"/>
-          <w:sz w:val="24"/>
-        </w:rPr>
-        <w:t xml:space="preserve"> </w:t>
+        <w:t xml:space="preserve">, построенная на нормированной взаимной информации рангов двух карт активности (дополнительные материалы, П3), – связана с профилем тесно и отрицательно (</w:t>
       </w:r>
       <m:oMath>
-        <m:sSub>
-          <m:e>
-            <m:r>
-              <m:t>E</m:t>
-            </m:r>
-          </m:e>
-          <m:sub>
-            <m:r>
-              <m:t>i</m:t>
-            </m:r>
-            <m:r>
-              <m:rPr>
-                <m:sty m:val="p"/>
-              </m:rPr>
-              <m:t>−</m:t>
-            </m:r>
-            <m:r>
-              <m:t>1</m:t>
-            </m:r>
-          </m:sub>
-        </m:sSub>
-      </m:oMath>
-      <w:r>
-        <w:rPr>
-          <w:rFonts w:ascii="Times New Roman" w:hAnsi="Times New Roman"/>
-          <w:sz w:val="24"/>
-        </w:rPr>
-        <w:t xml:space="preserve"> </w:t>
-      </w:r>
-      <w:r>
-        <w:rPr>
-          <w:rFonts w:ascii="Times New Roman" w:hAnsi="Times New Roman"/>
-          <w:sz w:val="24"/>
-        </w:rPr>
-        <w:t xml:space="preserve">и</w:t>
-      </w:r>
-      <w:r>
-        <w:rPr>
-          <w:rFonts w:ascii="Times New Roman" w:hAnsi="Times New Roman"/>
-          <w:sz w:val="24"/>
-        </w:rPr>
-        <w:t xml:space="preserve"> </w:t>
-      </w:r>
-      <m:oMath>
-        <m:sSub>
-          <m:e>
-            <m:r>
-              <m:t>E</m:t>
-            </m:r>
-          </m:e>
-          <m:sub>
-            <m:r>
-              <m:t>i</m:t>
-            </m:r>
-          </m:sub>
-        </m:sSub>
-      </m:oMath>
-      <w:r>
-        <w:rPr>
-          <w:rFonts w:ascii="Times New Roman" w:hAnsi="Times New Roman"/>
-          <w:sz w:val="24"/>
-        </w:rPr>
-        <w:t xml:space="preserve"> </w:t>
-      </w:r>
-      <w:r>
-        <w:rPr>
-          <w:rFonts w:ascii="Times New Roman" w:hAnsi="Times New Roman"/>
-          <w:sz w:val="24"/>
-        </w:rPr>
-        <w:t xml:space="preserve">по узлам внутренней части области разбиваются на</w:t>
-      </w:r>
-      <w:r>
-        <w:rPr>
-          <w:rFonts w:ascii="Times New Roman" w:hAnsi="Times New Roman"/>
-          <w:sz w:val="24"/>
-        </w:rPr>
-        <w:t xml:space="preserve"> </w:t>
-      </w:r>
-      <m:oMath>
-        <m:r>
-          <m:t>k</m:t>
+        <m:r>
+          <m:t>ρ</m:t>
         </m:r>
         <m:r>
           <m:rPr>
@@ -4974,7 +4529,13 @@
           <m:t>=</m:t>
         </m:r>
         <m:r>
-          <m:t>16</m:t>
+          <m:rPr>
+            <m:sty m:val="p"/>
+          </m:rPr>
+          <m:t>−</m:t>
+        </m:r>
+        <m:r>
+          <m:t>0.86</m:t>
         </m:r>
       </m:oMath>
       <w:r>
@@ -4989,46 +4550,11 @@
           <w:rFonts w:ascii="Times New Roman" w:hAnsi="Times New Roman"/>
           <w:sz w:val="24"/>
         </w:rPr>
-        <w:t xml:space="preserve">равночастотных корзин, по двумерной гистограмме вычисляется взаимная информация</w:t>
-      </w:r>
-      <w:r>
-        <w:rPr>
-          <w:rFonts w:ascii="Times New Roman" w:hAnsi="Times New Roman"/>
-          <w:sz w:val="24"/>
-        </w:rPr>
-        <w:t xml:space="preserve"> </w:t>
+        <w:t xml:space="preserve">по 39 областям), тогда как связь профиля с амплитудой полос и с временной устойчивостью карт активности практически отсутствует (</w:t>
       </w:r>
       <m:oMath>
-        <m:sSub>
-          <m:e>
-            <m:r>
-              <m:t>I</m:t>
-            </m:r>
-          </m:e>
-          <m:sub>
-            <m:r>
-              <m:t>i</m:t>
-            </m:r>
-          </m:sub>
-        </m:sSub>
-      </m:oMath>
-      <w:r>
-        <w:rPr>
-          <w:rFonts w:ascii="Times New Roman" w:hAnsi="Times New Roman"/>
-          <w:sz w:val="24"/>
-        </w:rPr>
-        <w:t xml:space="preserve">, нормируемая на энтропию</w:t>
-      </w:r>
-      <w:r>
-        <w:rPr>
-          <w:rFonts w:ascii="Times New Roman" w:hAnsi="Times New Roman"/>
-          <w:sz w:val="24"/>
-        </w:rPr>
-        <w:t xml:space="preserve"> </w:t>
-      </w:r>
-      <m:oMath>
-        <m:r>
-          <m:t>H</m:t>
+        <m:r>
+          <m:t>ρ</m:t>
         </m:r>
         <m:r>
           <m:rPr>
@@ -5040,10 +4566,10 @@
           <m:rPr>
             <m:sty m:val="p"/>
           </m:rPr>
-          <m:t>ln</m:t>
-        </m:r>
-        <m:r>
-          <m:t>k</m:t>
+          <m:t>+</m:t>
+        </m:r>
+        <m:r>
+          <m:t>0.13</m:t>
         </m:r>
       </m:oMath>
       <w:r>
@@ -5051,7 +4577,14 @@
           <w:rFonts w:ascii="Times New Roman" w:hAnsi="Times New Roman"/>
           <w:sz w:val="24"/>
         </w:rPr>
-        <w:t xml:space="preserve">, и</w:t>
+        <w:t xml:space="preserve"> </w:t>
+      </w:r>
+      <w:r>
+        <w:rPr>
+          <w:rFonts w:ascii="Times New Roman" w:hAnsi="Times New Roman"/>
+          <w:sz w:val="24"/>
+        </w:rPr>
+        <w:t xml:space="preserve">и</w:t>
       </w:r>
       <w:r>
         <w:rPr>
@@ -5061,18 +4594,92 @@
         <w:t xml:space="preserve"> </w:t>
       </w:r>
       <m:oMath>
-        <m:sSub>
-          <m:e>
-            <m:r>
-              <m:t>u</m:t>
-            </m:r>
-          </m:e>
-          <m:sub>
-            <m:r>
-              <m:t>i</m:t>
-            </m:r>
-          </m:sub>
-        </m:sSub>
+        <m:r>
+          <m:rPr>
+            <m:sty m:val="p"/>
+          </m:rPr>
+          <m:t>+</m:t>
+        </m:r>
+        <m:r>
+          <m:t>0.06</m:t>
+        </m:r>
+      </m:oMath>
+      <w:r>
+        <w:rPr>
+          <w:rFonts w:ascii="Times New Roman" w:hAnsi="Times New Roman"/>
+          <w:sz w:val="24"/>
+        </w:rPr>
+        <w:t xml:space="preserve">). Профиль, таким образом, является сводкой именно совместного размещения активности соседних уровней, а не тенью амплитуды или инерции поля. Направления влияния он не устанавливает: та же сопряженность совместима и с тем, что крупный уровень задает размещение мелкого, и с обратным, и с общей причиной.</w:t>
+      </w:r>
+    </w:p>
+    <w:bookmarkEnd w:id="20"/>
+    <w:bookmarkStart w:id="21" w:name="чего-она-не-измеряет"/>
+    <w:p>
+      <w:pPr>
+        <w:pStyle w:val="Heading2"/>
+      </w:pPr>
+      <w:r>
+        <w:rPr>
+          <w:rFonts w:ascii="Times New Roman" w:hAnsi="Times New Roman"/>
+          <w:sz w:val="24"/>
+        </w:rPr>
+        <w:t xml:space="preserve">Чего она не измеряет</w:t>
+      </w:r>
+    </w:p>
+    <w:p>
+      <w:pPr>
+        <w:pStyle w:val="FirstParagraph"/>
+      </w:pPr>
+      <w:r>
+        <w:rPr>
+          <w:rFonts w:ascii="Times New Roman" w:hAnsi="Times New Roman"/>
+          <w:sz w:val="24"/>
+        </w:rPr>
+        <w:t xml:space="preserve">Границы применимости установлены прямыми проверками (табл. 3; полный перечень – в дополнительных материалах, П4). Дескриптор не измеряет межмасштабный поток кинетической энергии: сопоставление с потоком, вычисленным методом пространственного огрубления (Aluie et al., 2018; Germano, 1992), объясняет доли процента его изменчивости. Вертикальная универсальность (уровень 500 гПа) не подтверждена. Прикладные гипотезы – о связи дескриптора с ростом ошибки прогноза, с мезомасштабной ошибкой анализа и с потерей мезомасштаба в нейросетевых моделях погоды (Bi et al., 2023; Lam et al., 2023; Price et al., 2025; Rasp et al., 2024) – не подтвердились: в каждом случае сильнее оказалась простая характеристика фонового состояния. Утверждение об инвариантности, таким образом, ограничено полем, уровнем, масштабами и периодом, перечисленными в постановке; работа не утверждает, что найден универсальный инвариант атмосферной динамики, самостоятельная динамическая переменная или мера межмасштабного переноса.</w:t>
+      </w:r>
+    </w:p>
+    <w:bookmarkEnd w:id="21"/>
+    <w:bookmarkEnd w:id="22"/>
+    <w:bookmarkStart w:id="23" w:name="заключение"/>
+    <w:p>
+      <w:pPr>
+        <w:pStyle w:val="Heading1"/>
+      </w:pPr>
+      <w:r>
+        <w:rPr>
+          <w:rFonts w:ascii="Times New Roman" w:hAnsi="Times New Roman"/>
+          <w:sz w:val="24"/>
+        </w:rPr>
+        <w:t xml:space="preserve">ЗАКЛЮЧЕНИЕ</w:t>
+      </w:r>
+    </w:p>
+    <w:p>
+      <w:pPr>
+        <w:pStyle w:val="FirstParagraph"/>
+      </w:pPr>
+      <w:r>
+        <w:rPr>
+          <w:rFonts w:ascii="Times New Roman" w:hAnsi="Times New Roman"/>
+          <w:sz w:val="24"/>
+        </w:rPr>
+        <w:t xml:space="preserve">Предложен инструмент измерения сопряженности соседних масштабных уровней атмосферной циркуляции – профиль сопряженности октавных полос по полю относительного вихря на 850 гПа. Его построение полностью описано операционально, все параметры зафиксированы до вычислений; новизна работы состоит в свойствах измеряемого объекта.</w:t>
+      </w:r>
+    </w:p>
+    <w:p>
+      <w:pPr>
+        <w:pStyle w:val="BodyText"/>
+      </w:pPr>
+      <w:r>
+        <w:rPr>
+          <w:rFonts w:ascii="Times New Roman" w:hAnsi="Times New Roman"/>
+          <w:sz w:val="24"/>
+        </w:rPr>
+        <w:t xml:space="preserve">Профиль удовлетворяет заранее сформулированному утверждению условной инвариантности (1): региональная группировка профилей воспроизводится между окнами, охватывающими разные сезоны, годы и фазы ЭНСО, – на отложенных выборках, внутри страт каждого из этих факторов и на уровне целых областей; на долю региона приходится 0.6–0.7 дисперсии профиля. Группировка сохраняется при смене источника данных и схемы разбиения территории, а региональная география воспроизводится в свободном модельном расчете, не усваивающем атмосферных наблюдений (</w:t>
+      </w:r>
+      <m:oMath>
+        <m:r>
+          <m:t>ρ</m:t>
+        </m:r>
         <m:r>
           <m:rPr>
             <m:sty m:val="p"/>
@@ -5080,34 +4687,7 @@
           <m:t>=</m:t>
         </m:r>
         <m:r>
-          <m:t>1</m:t>
-        </m:r>
-        <m:r>
-          <m:rPr>
-            <m:sty m:val="p"/>
-          </m:rPr>
-          <m:t>−</m:t>
-        </m:r>
-        <m:sSub>
-          <m:e>
-            <m:r>
-              <m:t>I</m:t>
-            </m:r>
-          </m:e>
-          <m:sub>
-            <m:r>
-              <m:t>i</m:t>
-            </m:r>
-          </m:sub>
-        </m:sSub>
-        <m:r>
-          <m:rPr>
-            <m:sty m:val="p"/>
-          </m:rPr>
-          <m:t>/</m:t>
-        </m:r>
-        <m:r>
-          <m:t>H</m:t>
+          <m:t>0.72</m:t>
         </m:r>
       </m:oMath>
       <w:r>
@@ -5115,188 +4695,14 @@
           <w:rFonts w:ascii="Times New Roman" w:hAnsi="Times New Roman"/>
           <w:sz w:val="24"/>
         </w:rPr>
-        <w:t xml:space="preserve">; далее, как и для профиля, берется медиана по срокам окна и среднее по разрешенным ступеням. Связь профиля с этой мерой отрицательна и тесна:</w:t>
-      </w:r>
-      <w:r>
-        <w:rPr>
-          <w:rFonts w:ascii="Times New Roman" w:hAnsi="Times New Roman"/>
-          <w:sz w:val="24"/>
-        </w:rPr>
-        <w:t xml:space="preserve"> </w:t>
-      </w:r>
-      <m:oMath>
-        <m:r>
-          <m:t>ρ</m:t>
-        </m:r>
-        <m:r>
-          <m:rPr>
-            <m:sty m:val="p"/>
-          </m:rPr>
-          <m:t>=</m:t>
-        </m:r>
-        <m:r>
-          <m:rPr>
-            <m:sty m:val="p"/>
-          </m:rPr>
-          <m:t>−</m:t>
-        </m:r>
-        <m:r>
-          <m:t>0.86</m:t>
-        </m:r>
-      </m:oMath>
-      <w:r>
-        <w:rPr>
-          <w:rFonts w:ascii="Times New Roman" w:hAnsi="Times New Roman"/>
-          <w:sz w:val="24"/>
-        </w:rPr>
-        <w:t xml:space="preserve"> </w:t>
-      </w:r>
-      <w:r>
-        <w:rPr>
-          <w:rFonts w:ascii="Times New Roman" w:hAnsi="Times New Roman"/>
-          <w:sz w:val="24"/>
-        </w:rPr>
-        <w:t xml:space="preserve">(39 областей). При этом связь профиля с амплитудой полос слаба (</w:t>
-      </w:r>
-      <m:oMath>
-        <m:r>
-          <m:t>ρ</m:t>
-        </m:r>
-        <m:r>
-          <m:rPr>
-            <m:sty m:val="p"/>
-          </m:rPr>
-          <m:t>=</m:t>
-        </m:r>
-        <m:r>
-          <m:rPr>
-            <m:sty m:val="p"/>
-          </m:rPr>
-          <m:t>+</m:t>
-        </m:r>
-        <m:r>
-          <m:t>0.13</m:t>
-        </m:r>
-      </m:oMath>
-      <w:r>
-        <w:rPr>
-          <w:rFonts w:ascii="Times New Roman" w:hAnsi="Times New Roman"/>
-          <w:sz w:val="24"/>
-        </w:rPr>
-        <w:t xml:space="preserve"> </w:t>
-      </w:r>
-      <w:r>
-        <w:rPr>
-          <w:rFonts w:ascii="Times New Roman" w:hAnsi="Times New Roman"/>
-          <w:sz w:val="24"/>
-        </w:rPr>
-        <w:t xml:space="preserve">с логарифмом дисперсии разрешенных полос, 12 областей), а с временной устойчивостью карт активности – автокорреляцией огибающей на лаге 6 ч – практически отсутствует (</w:t>
-      </w:r>
-      <m:oMath>
-        <m:r>
-          <m:t>ρ</m:t>
-        </m:r>
-        <m:r>
-          <m:rPr>
-            <m:sty m:val="p"/>
-          </m:rPr>
-          <m:t>=</m:t>
-        </m:r>
-        <m:r>
-          <m:rPr>
-            <m:sty m:val="p"/>
-          </m:rPr>
-          <m:t>+</m:t>
-        </m:r>
-        <m:r>
-          <m:t>0.06</m:t>
-        </m:r>
-      </m:oMath>
-      <w:r>
-        <w:rPr>
-          <w:rFonts w:ascii="Times New Roman" w:hAnsi="Times New Roman"/>
-          <w:sz w:val="24"/>
-        </w:rPr>
-        <w:t xml:space="preserve">, 39 областей). Профиль, таким образом, является сводкой именно совместного размещения активности соседних уровней и не является тенью ни амплитуды, ни инерции поля. Направления влияния он не устанавливает: та же сопряженность совместима и с тем, что крупный уровень задает размещение мелкого, и с обратным, и с общей причиной.</w:t>
-      </w:r>
-    </w:p>
-    <w:bookmarkEnd w:id="20"/>
-    <w:bookmarkStart w:id="21" w:name="чего-она-не-измеряет"/>
-    <w:p>
-      <w:pPr>
-        <w:pStyle w:val="Heading2"/>
-      </w:pPr>
-      <w:r>
-        <w:rPr>
-          <w:rFonts w:ascii="Times New Roman" w:hAnsi="Times New Roman"/>
-          <w:sz w:val="24"/>
-        </w:rPr>
-        <w:t xml:space="preserve">Чего она не измеряет</w:t>
-      </w:r>
-    </w:p>
-    <w:p>
-      <w:pPr>
-        <w:pStyle w:val="FirstParagraph"/>
-      </w:pPr>
-      <w:r>
-        <w:rPr>
-          <w:rFonts w:ascii="Times New Roman" w:hAnsi="Times New Roman"/>
-          <w:sz w:val="24"/>
-        </w:rPr>
-        <w:t xml:space="preserve">Границы применимости установлены прямыми проверками (табл. 3; полный перечень – в дополнительных материалах). Дескриптор не измеряет межмасштабный поток кинетической энергии: прямое сопоставление с потоком, вычисленным методом пространственного огрубления (Aluie et al., 2018; Germano, 1992), объясняет доли процента его изменчивости, а характеристики поля деформации информативнее на два порядка. Вертикальной универсальности не обнаружено: на уровне 500 гПа региональная сигнатура статистически не подтверждается при вдвое меньшей выборке. Три прикладные гипотезы – о связи дескриптора со скоростью роста ошибки ансамблевого прогноза, с мезомасштабной ошибкой анализа и с потерей мезомасштаба в нейросетевых моделях погоды (Bi et al., 2023; Lam et al., 2023; Price et al., 2025; Rasp et al., 2024) – не подтвердились: в каждом случае более сильным предиктором оказалась простая характеристика фонового состояния. Первоначально предлагавшийся второй дескриптор – индекс невзаимности операторов агрегирования и детализации – воспроизводим, но следует за временной устойчивостью поля, а не за восстановимостью мелкого уровня по крупному, и выведен из изложения. Утверждение об инвариантности, таким образом, ограничено полем, уровнем, масштабами и периодом, перечисленными в постановке; работа не утверждает, что найден универсальный инвариант атмосферной динамики, самостоятельная динамическая переменная или мера межмасштабного переноса.</w:t>
-      </w:r>
-    </w:p>
-    <w:bookmarkEnd w:id="21"/>
-    <w:bookmarkEnd w:id="22"/>
-    <w:bookmarkStart w:id="23" w:name="заключение"/>
-    <w:p>
-      <w:pPr>
-        <w:pStyle w:val="Heading1"/>
-      </w:pPr>
-      <w:r>
-        <w:rPr>
-          <w:rFonts w:ascii="Times New Roman" w:hAnsi="Times New Roman"/>
-          <w:sz w:val="24"/>
-        </w:rPr>
-        <w:t xml:space="preserve">ЗАКЛЮЧЕНИЕ</w:t>
-      </w:r>
-    </w:p>
-    <w:p>
-      <w:pPr>
-        <w:pStyle w:val="FirstParagraph"/>
-      </w:pPr>
-      <w:r>
-        <w:rPr>
-          <w:rFonts w:ascii="Times New Roman" w:hAnsi="Times New Roman"/>
-          <w:sz w:val="24"/>
-        </w:rPr>
-        <w:t xml:space="preserve">Предложен инструмент измерения сопряженности соседних масштабных уровней атмосферной циркуляции – профиль сопряженности октавных полос</w:t>
-      </w:r>
-      <w:r>
-        <w:rPr>
-          <w:rFonts w:ascii="Times New Roman" w:hAnsi="Times New Roman"/>
-          <w:sz w:val="24"/>
-        </w:rPr>
-        <w:t xml:space="preserve"> </w:t>
-      </w:r>
-      <m:oMath>
-        <m:r>
-          <m:t>P</m:t>
-        </m:r>
-      </m:oMath>
-      <w:r>
-        <w:rPr>
-          <w:rFonts w:ascii="Times New Roman" w:hAnsi="Times New Roman"/>
-          <w:sz w:val="24"/>
-        </w:rPr>
-        <w:t xml:space="preserve"> </w:t>
-      </w:r>
-      <w:r>
-        <w:rPr>
-          <w:rFonts w:ascii="Times New Roman" w:hAnsi="Times New Roman"/>
-          <w:sz w:val="24"/>
-        </w:rPr>
-        <w:t xml:space="preserve">по полю относительного вихря на 850 гПа. Его построение полностью описано операционально, все параметры зафиксированы до вычислений; новизна работы состоит в свойствах измеряемого объекта.</w:t>
+        <w:t xml:space="preserve"> </w:t>
+      </w:r>
+      <w:r>
+        <w:rPr>
+          <w:rFonts w:ascii="Times New Roman" w:hAnsi="Times New Roman"/>
+          <w:sz w:val="24"/>
+        </w:rPr>
+        <w:t xml:space="preserve">по 39 областям), поэтому наблюдаемая структура не может быть объяснена только устройством наблюдательной сети или процедурой усвоения.</w:t>
       </w:r>
     </w:p>
     <w:p>
@@ -5308,355 +4714,7 @@
           <w:rFonts w:ascii="Times New Roman" w:hAnsi="Times New Roman"/>
           <w:sz w:val="24"/>
         </w:rPr>
-        <w:t xml:space="preserve">Профиль удовлетворяет заранее сформулированному утверждению условной инвариантности (1): региональная группировка профилей воспроизводится между окнами, охватывающими разные сезоны, годы и фазы ЭНСО (</w:t>
-      </w:r>
-      <m:oMath>
-        <m:r>
-          <m:rPr>
-            <m:sty m:val="p"/>
-          </m:rPr>
-          <m:t>Δ</m:t>
-        </m:r>
-        <m:r>
-          <m:rPr>
-            <m:sty m:val="p"/>
-          </m:rPr>
-          <m:t>=</m:t>
-        </m:r>
-        <m:r>
-          <m:rPr>
-            <m:sty m:val="p"/>
-          </m:rPr>
-          <m:t>+</m:t>
-        </m:r>
-        <m:r>
-          <m:t>0.81</m:t>
-        </m:r>
-      </m:oMath>
-      <w:r>
-        <w:rPr>
-          <w:rFonts w:ascii="Times New Roman" w:hAnsi="Times New Roman"/>
-          <w:sz w:val="24"/>
-        </w:rPr>
-        <w:t xml:space="preserve">,</w:t>
-      </w:r>
-      <w:r>
-        <w:rPr>
-          <w:rFonts w:ascii="Times New Roman" w:hAnsi="Times New Roman"/>
-          <w:sz w:val="24"/>
-        </w:rPr>
-        <w:t xml:space="preserve"> </w:t>
-      </w:r>
-      <m:oMath>
-        <m:r>
-          <m:t>p</m:t>
-        </m:r>
-        <m:r>
-          <m:rPr>
-            <m:sty m:val="p"/>
-          </m:rPr>
-          <m:t>=</m:t>
-        </m:r>
-        <m:r>
-          <m:t>0.001</m:t>
-        </m:r>
-      </m:oMath>
-      <w:r>
-        <w:rPr>
-          <w:rFonts w:ascii="Times New Roman" w:hAnsi="Times New Roman"/>
-          <w:sz w:val="24"/>
-        </w:rPr>
-        <w:t xml:space="preserve"> </w:t>
-      </w:r>
-      <w:r>
-        <w:rPr>
-          <w:rFonts w:ascii="Times New Roman" w:hAnsi="Times New Roman"/>
-          <w:sz w:val="24"/>
-        </w:rPr>
-        <w:t xml:space="preserve">на отложенных выборках; внутри страт сезона, года и периода</w:t>
-      </w:r>
-      <w:r>
-        <w:rPr>
-          <w:rFonts w:ascii="Times New Roman" w:hAnsi="Times New Roman"/>
-          <w:sz w:val="24"/>
-        </w:rPr>
-        <w:t xml:space="preserve"> </w:t>
-      </w:r>
-      <m:oMath>
-        <m:r>
-          <m:rPr>
-            <m:sty m:val="p"/>
-          </m:rPr>
-          <m:t>Δ</m:t>
-        </m:r>
-        <m:r>
-          <m:rPr>
-            <m:sty m:val="p"/>
-          </m:rPr>
-          <m:t>=</m:t>
-        </m:r>
-        <m:r>
-          <m:rPr>
-            <m:sty m:val="p"/>
-          </m:rPr>
-          <m:t>+</m:t>
-        </m:r>
-        <m:r>
-          <m:t>1.00</m:t>
-        </m:r>
-      </m:oMath>
-      <w:r>
-        <w:rPr>
-          <w:rFonts w:ascii="Times New Roman" w:hAnsi="Times New Roman"/>
-          <w:sz w:val="24"/>
-        </w:rPr>
-        <w:t xml:space="preserve">,</w:t>
-      </w:r>
-      <w:r>
-        <w:rPr>
-          <w:rFonts w:ascii="Times New Roman" w:hAnsi="Times New Roman"/>
-          <w:sz w:val="24"/>
-        </w:rPr>
-        <w:t xml:space="preserve"> </w:t>
-      </w:r>
-      <m:oMath>
-        <m:r>
-          <m:t>p</m:t>
-        </m:r>
-        <m:r>
-          <m:rPr>
-            <m:sty m:val="p"/>
-          </m:rPr>
-          <m:t>=</m:t>
-        </m:r>
-        <m:r>
-          <m:t>0.001</m:t>
-        </m:r>
-      </m:oMath>
-      <w:r>
-        <w:rPr>
-          <w:rFonts w:ascii="Times New Roman" w:hAnsi="Times New Roman"/>
-          <w:sz w:val="24"/>
-        </w:rPr>
-        <w:t xml:space="preserve">; доля региона в дисперсии 0.6–0.7), при смене источника данных (MERRA-2:</w:t>
-      </w:r>
-      <w:r>
-        <w:rPr>
-          <w:rFonts w:ascii="Times New Roman" w:hAnsi="Times New Roman"/>
-          <w:sz w:val="24"/>
-        </w:rPr>
-        <w:t xml:space="preserve"> </w:t>
-      </w:r>
-      <m:oMath>
-        <m:r>
-          <m:rPr>
-            <m:sty m:val="p"/>
-          </m:rPr>
-          <m:t>Δ</m:t>
-        </m:r>
-        <m:r>
-          <m:rPr>
-            <m:sty m:val="p"/>
-          </m:rPr>
-          <m:t>=</m:t>
-        </m:r>
-        <m:r>
-          <m:rPr>
-            <m:sty m:val="p"/>
-          </m:rPr>
-          <m:t>+</m:t>
-        </m:r>
-        <m:r>
-          <m:t>1.09</m:t>
-        </m:r>
-      </m:oMath>
-      <w:r>
-        <w:rPr>
-          <w:rFonts w:ascii="Times New Roman" w:hAnsi="Times New Roman"/>
-          <w:sz w:val="24"/>
-        </w:rPr>
-        <w:t xml:space="preserve">,</w:t>
-      </w:r>
-      <w:r>
-        <w:rPr>
-          <w:rFonts w:ascii="Times New Roman" w:hAnsi="Times New Roman"/>
-          <w:sz w:val="24"/>
-        </w:rPr>
-        <w:t xml:space="preserve"> </w:t>
-      </w:r>
-      <m:oMath>
-        <m:r>
-          <m:t>p</m:t>
-        </m:r>
-        <m:r>
-          <m:rPr>
-            <m:sty m:val="p"/>
-          </m:rPr>
-          <m:t>=</m:t>
-        </m:r>
-        <m:r>
-          <m:t>0.001</m:t>
-        </m:r>
-      </m:oMath>
-      <w:r>
-        <w:rPr>
-          <w:rFonts w:ascii="Times New Roman" w:hAnsi="Times New Roman"/>
-          <w:sz w:val="24"/>
-        </w:rPr>
-        <w:t xml:space="preserve">; география</w:t>
-      </w:r>
-      <w:r>
-        <w:rPr>
-          <w:rFonts w:ascii="Times New Roman" w:hAnsi="Times New Roman"/>
-          <w:sz w:val="24"/>
-        </w:rPr>
-        <w:t xml:space="preserve"> </w:t>
-      </w:r>
-      <m:oMath>
-        <m:r>
-          <m:t>ρ</m:t>
-        </m:r>
-        <m:r>
-          <m:rPr>
-            <m:sty m:val="p"/>
-          </m:rPr>
-          <m:t>=</m:t>
-        </m:r>
-        <m:r>
-          <m:t>0.77</m:t>
-        </m:r>
-      </m:oMath>
-      <w:r>
-        <w:rPr>
-          <w:rFonts w:ascii="Times New Roman" w:hAnsi="Times New Roman"/>
-          <w:sz w:val="24"/>
-        </w:rPr>
-        <w:t xml:space="preserve">) и схемы разбиения территории (равновеликие области:</w:t>
-      </w:r>
-      <w:r>
-        <w:rPr>
-          <w:rFonts w:ascii="Times New Roman" w:hAnsi="Times New Roman"/>
-          <w:sz w:val="24"/>
-        </w:rPr>
-        <w:t xml:space="preserve"> </w:t>
-      </w:r>
-      <m:oMath>
-        <m:r>
-          <m:rPr>
-            <m:sty m:val="p"/>
-          </m:rPr>
-          <m:t>Δ</m:t>
-        </m:r>
-        <m:r>
-          <m:rPr>
-            <m:sty m:val="p"/>
-          </m:rPr>
-          <m:t>=</m:t>
-        </m:r>
-        <m:r>
-          <m:rPr>
-            <m:sty m:val="p"/>
-          </m:rPr>
-          <m:t>+</m:t>
-        </m:r>
-        <m:r>
-          <m:t>0.75</m:t>
-        </m:r>
-      </m:oMath>
-      <w:r>
-        <w:rPr>
-          <w:rFonts w:ascii="Times New Roman" w:hAnsi="Times New Roman"/>
-          <w:sz w:val="24"/>
-        </w:rPr>
-        <w:t xml:space="preserve"> </w:t>
-      </w:r>
-      <w:r>
-        <w:rPr>
-          <w:rFonts w:ascii="Times New Roman" w:hAnsi="Times New Roman"/>
-          <w:sz w:val="24"/>
-        </w:rPr>
-        <w:t xml:space="preserve">и</w:t>
-      </w:r>
-      <w:r>
-        <w:rPr>
-          <w:rFonts w:ascii="Times New Roman" w:hAnsi="Times New Roman"/>
-          <w:sz w:val="24"/>
-        </w:rPr>
-        <w:t xml:space="preserve"> </w:t>
-      </w:r>
-      <m:oMath>
-        <m:r>
-          <m:rPr>
-            <m:sty m:val="p"/>
-          </m:rPr>
-          <m:t>+</m:t>
-        </m:r>
-        <m:r>
-          <m:t>1.03</m:t>
-        </m:r>
-      </m:oMath>
-      <w:r>
-        <w:rPr>
-          <w:rFonts w:ascii="Times New Roman" w:hAnsi="Times New Roman"/>
-          <w:sz w:val="24"/>
-        </w:rPr>
-        <w:t xml:space="preserve">,</w:t>
-      </w:r>
-      <w:r>
-        <w:rPr>
-          <w:rFonts w:ascii="Times New Roman" w:hAnsi="Times New Roman"/>
-          <w:sz w:val="24"/>
-        </w:rPr>
-        <w:t xml:space="preserve"> </w:t>
-      </w:r>
-      <m:oMath>
-        <m:r>
-          <m:t>p</m:t>
-        </m:r>
-        <m:r>
-          <m:rPr>
-            <m:sty m:val="p"/>
-          </m:rPr>
-          <m:t>=</m:t>
-        </m:r>
-        <m:r>
-          <m:t>0.001</m:t>
-        </m:r>
-      </m:oMath>
-      <w:r>
-        <w:rPr>
-          <w:rFonts w:ascii="Times New Roman" w:hAnsi="Times New Roman"/>
-          <w:sz w:val="24"/>
-        </w:rPr>
-        <w:t xml:space="preserve">). Региональная география воспроизводится в свободном модельном расчете, не усваивающем атмосферных наблюдений (</w:t>
-      </w:r>
-      <m:oMath>
-        <m:r>
-          <m:t>ρ</m:t>
-        </m:r>
-        <m:r>
-          <m:rPr>
-            <m:sty m:val="p"/>
-          </m:rPr>
-          <m:t>=</m:t>
-        </m:r>
-        <m:r>
-          <m:t>0.72</m:t>
-        </m:r>
-      </m:oMath>
-      <w:r>
-        <w:rPr>
-          <w:rFonts w:ascii="Times New Roman" w:hAnsi="Times New Roman"/>
-          <w:sz w:val="24"/>
-        </w:rPr>
-        <w:t xml:space="preserve"> </w:t>
-      </w:r>
-      <w:r>
-        <w:rPr>
-          <w:rFonts w:ascii="Times New Roman" w:hAnsi="Times New Roman"/>
-          <w:sz w:val="24"/>
-        </w:rPr>
-        <w:t xml:space="preserve">при ориентире межпериодной воспроизводимости ERA5 0.90–0.95; 39 областей), поэтому наблюдаемая структура не может быть объяснена только устройством наблюдательной сети или процедурой усвоения.</w:t>
+        <w:t xml:space="preserve">География дескриптора систематична: выше – тропический теплый бассейн Тихого океана, бассейн Конго и внетропические штормовые пути, ниже – континентальные области умеренного пояса и Амазония. Бассейны Конго и Амазонии, единственные два очага глубокой конвекции над сушей в заранее заданном наборе, различаются сопряженностью крупных полос с неперекрывающимися размахами по окнам. Дескриптор различает территории, близкие по стандартным характеристикам режима, и в этом качестве продолжает линию инвариантов организации геосистем – от выделения уровней к измерению их сопряженности.</w:t>
       </w:r>
     </w:p>
     <w:p>
@@ -5668,40 +4726,7 @@
           <w:rFonts w:ascii="Times New Roman" w:hAnsi="Times New Roman"/>
           <w:sz w:val="24"/>
         </w:rPr>
-        <w:t xml:space="preserve">География дескриптора систематична: выше – тропический теплый бассейн Тихого океана, бассейн Конго и внетропические штормовые пути, ниже – континентальные области умеренного пояса и Амазония. Бассейны Конго и Амазонии, единственные два очага глубокой конвекции над сушей в заранее заданном наборе, различаются сопряженностью крупных полос с неперекрывающимися размахами по окнам (</w:t>
-      </w:r>
-      <m:oMath>
-        <m:sSub>
-          <m:e>
-            <m:r>
-              <m:t>ρ</m:t>
-            </m:r>
-          </m:e>
-          <m:sub>
-            <m:r>
-              <m:t>5</m:t>
-            </m:r>
-          </m:sub>
-        </m:sSub>
-      </m:oMath>
-      <w:r>
-        <w:rPr>
-          <w:rFonts w:ascii="Times New Roman" w:hAnsi="Times New Roman"/>
-          <w:sz w:val="24"/>
-        </w:rPr>
-        <w:t xml:space="preserve">: 0.59–0.82 против 0.38–0.54), и контраст сохраняется при контроле равновеликими областями. Дескриптор различает территории, близкие по стандартным характеристикам режима, и в этом качестве продолжает линию инвариантов организации геосистем – от выделения уровней к измерению их сопряженности.</w:t>
-      </w:r>
-    </w:p>
-    <w:p>
-      <w:pPr>
-        <w:pStyle w:val="BodyText"/>
-      </w:pPr>
-      <w:r>
-        <w:rPr>
-          <w:rFonts w:ascii="Times New Roman" w:hAnsi="Times New Roman"/>
-          <w:sz w:val="24"/>
-        </w:rPr>
-        <w:t xml:space="preserve">Границы применимости установлены прямыми проверками: дескриптор не измеряет межмасштабный поток кинетической энергии и не устанавливает направления влияния между уровнями; вертикальная универсальность не подтверждена; три прикладные гипотезы не подтверждены на имеющихся данных; вопрос об информации сверх спектра мощности остается открытым.</w:t>
+        <w:t xml:space="preserve">Границы применимости установлены прямыми проверками: дескриптор не измеряет межмасштабный поток кинетической энергии и не устанавливает направления влияния между уровнями; вертикальная универсальность и прикладные гипотезы не подтверждены; вопрос об информации сверх спектра мощности остается открытым.</w:t>
       </w:r>
     </w:p>
     <w:p>
@@ -12144,47 +11169,7 @@
           <w:rFonts w:ascii="Times New Roman" w:hAnsi="Times New Roman"/>
           <w:sz w:val="24"/>
         </w:rPr>
-        <w:t xml:space="preserve">Spectral and fractal analysis of geographical fields answers the question of the scales at which the levels of organisation of a geosystem are located. The next question concerns the relation between levels: is mesoscale variability placed where the adjacent large level is active, or independently of it? Using the relative-vorticity field at 850 hPa (ERA5 reanalysis, 2017–2024; 12 main and 27 control regions) we construct a measure of this relation, the coupling profile of adjacent octave scale bands</w:t>
-      </w:r>
-      <w:r>
-        <w:rPr>
-          <w:rFonts w:ascii="Times New Roman" w:hAnsi="Times New Roman"/>
-          <w:sz w:val="24"/>
-        </w:rPr>
-        <w:t xml:space="preserve"> </w:t>
-      </w:r>
-      <m:oMath>
-        <m:r>
-          <m:t>P</m:t>
-        </m:r>
-      </m:oMath>
-      <w:r>
-        <w:rPr>
-          <w:rFonts w:ascii="Times New Roman" w:hAnsi="Times New Roman"/>
-          <w:sz w:val="24"/>
-        </w:rPr>
-        <w:t xml:space="preserve">: the spatial rank correlation of the activity maps of two adjacent bands, supplemented by its excess over phase surrogates of the field. We test the hypothesis that the profile is a regional invariant in the operational sense: it distinguishes circulation regimes and is reproduced across seasonal windows of different years and ENSO phases, in two reanalyses and under two partitions of the territory. The regional grouping of profiles is confirmed on held-out windows (</w:t>
-      </w:r>
-      <m:oMath>
-        <m:r>
-          <m:t>p</m:t>
-        </m:r>
-        <m:r>
-          <m:rPr>
-            <m:sty m:val="p"/>
-          </m:rPr>
-          <m:t>=</m:t>
-        </m:r>
-        <m:r>
-          <m:t>0.001</m:t>
-        </m:r>
-      </m:oMath>
-      <w:r>
-        <w:rPr>
-          <w:rFonts w:ascii="Times New Roman" w:hAnsi="Times New Roman"/>
-          <w:sz w:val="24"/>
-        </w:rPr>
-        <w:t xml:space="preserve">) and under permutations within strata of season, year and period; the region accounts for 0.6–0.7 of the profile variance. The signature survives restriction to the steps resolved by the reanalysis, is reproduced under an equal-area partition, in a second reanalysis and in a free-running model integration that assimilates no atmospheric observations (rank correlation of the geography 0.72 over 39 regions). Higher values belong to the tropical warm pool of the Pacific, the Congo basin and the extratropical storm tracks, lower values to continental regions and the Amazon; the Congo and Amazon basins, similar in standard regime characteristics, differ in the coupling of their large bands. The quantity adds to the toolkit of regionalisation a characteristic of the structure of inter-level relations; its limits of applicability are stated explicitly.</w:t>
+        <w:t xml:space="preserve">Spectral and fractal analysis of geographical fields answers the question of the scales at which the levels of organisation of a geosystem are located. The next question concerns the relation between levels: is mesoscale variability placed where the adjacent large level is active, or independently of it? Using the relative-vorticity field at 850 hPa (ERA5 reanalysis, 2017–2024; 12 main and 27 control regions) we construct a measure of this relation, the coupling profile of adjacent octave scale bands: the spatial rank correlation of the activity maps of two adjacent bands, supplemented by its excess over phase surrogates of the field. We test the hypothesis that the profile is a regional invariant: it distinguishes circulation regimes and is reproduced across seasonal windows of different years and ENSO phases. The regional grouping of profiles is confirmed on held-out windows and under permutations within strata of season, year and period; the region accounts for 0.6–0.7 of the profile variance. The grouping survives restriction to the resolved steps, an equal-area partition, a second reanalysis and a free-running model integration without assimilation of atmospheric observations. Higher values belong to the tropical warm pool of the Pacific, the Congo basin and the extratropical storm tracks, lower values to continental regions and the Amazon; the Congo and Amazon basins, similar in standard regime characteristics, differ in the coupling of their large bands. The quantity adds to regionalisation a characteristic of inter-level relations; its limits of applicability are stated explicitly.</w:t>
       </w:r>
     </w:p>
     <w:p>
@@ -12289,7 +11274,7 @@
         <w:t xml:space="preserve"> </w:t>
       </w:r>
       <w:r>
-        <w:t xml:space="preserve">https://github.com/Theclimateguy/Shroedinger, релиз v6.5 (коммит [COMMIT]); постоянный архив версий – Zenodo, doi: 10.5281/zenodo.19565769, версионный doi: [ZENODO-V6.5]. Маршрут воспроизведения каждого числа таблицы 2 описан в файле reproducibility/article1_README.md; дополнительные материалы (полные рисунки и таблицы проверок) – в том же релизе.</w:t>
+        <w:t xml:space="preserve">https://github.com/Theclimateguy/Shroedinger, релиз v6.5 (тег v6.5; дата обращения 10.10.2026); постоянный архив версий – Zenodo, doi: 10.5281/zenodo.19565769 (версия 6.5). Маршрут воспроизведения каждого числа таблицы 2 описан в файле reproducibility/article1_README.md (раздел 0); дополнительные материалы (полные рисунки и таблицы проверок) – в том же релизе.</w:t>
       </w:r>
     </w:p>
   </w:footnote>

</xml_diff>

<commit_message>
Article 1 v8: supplementary materials cited as a repository file; resubmission package without the supplement
Co-Authored-By: Claude Fable 5.1 <noreply@anthropic.com>
</commit_message>
<xml_diff>
--- a/manuscript_v2/article1/article1_v8.docx
+++ b/manuscript_v2/article1/article1_v8.docx
@@ -4108,7 +4108,7 @@
           <w:rFonts w:ascii="Times New Roman" w:hAnsi="Times New Roman"/>
           <w:sz w:val="24"/>
         </w:rPr>
-        <w:t xml:space="preserve">результата не меняют (дополнительные материалы, П2).</w:t>
+        <w:t xml:space="preserve">результата не меняют (дополнительные материалы в репозитории, П2).</w:t>
       </w:r>
     </w:p>
     <w:p>
@@ -11274,7 +11274,7 @@
         <w:t xml:space="preserve"> </w:t>
       </w:r>
       <w:r>
-        <w:t xml:space="preserve">https://github.com/Theclimateguy/Shroedinger, релиз v6.5 (тег v6.5; дата обращения 10.10.2026); постоянный архив версий – Zenodo, doi: 10.5281/zenodo.19565769; версия 6.5: doi: 10.5281/zenodo.23282333. Маршрут воспроизведения каждого числа таблицы 2 описан в файле reproducibility/article1_README.md (раздел 0); дополнительные материалы (полные рисунки и таблицы проверок) – в том же релизе.</w:t>
+        <w:t xml:space="preserve">https://github.com/Theclimateguy/Shroedinger, релиз v6.5 (тег v6.5; дата обращения 10.10.2026); постоянный архив версий – Zenodo, doi: 10.5281/zenodo.19565769; версия 6.5: doi: 10.5281/zenodo.23282333. Маршрут воспроизведения каждого числа таблицы 2 описан в файле reproducibility/article1_README.md (раздел 0). Дополнительные материалы (полные профили, контроль геометрии, дополнительные панели модельного расчета, полный перечень проверенных интерпретаций, таблицы чувствительности; разделы П1–П6) – файл manuscript_v2/article1/article1_v8_supplement.pdf в том же репозитории.</w:t>
       </w:r>
     </w:p>
   </w:footnote>

</xml_diff>